<commit_message>
feat: giris API'si, JWT token ve auth middleware eklendi
</commit_message>
<xml_diff>
--- a/emlaknode_rapor.docx
+++ b/emlaknode_rapor.docx
@@ -19,8 +19,6 @@
         </w:rPr>
         <w:t xml:space="preserve">EMLAK NODE </w:t>
       </w:r>
-      <w:bookmarkStart w:id="0" w:name="_GoBack"/>
-      <w:bookmarkEnd w:id="0"/>
     </w:p>
     <w:p>
       <w:pPr>
@@ -924,434 +922,597 @@
     </w:p>
     <w:p>
       <w:pPr>
-        <w:spacing w:before="100" w:beforeAutospacing="1" w:after="100" w:afterAutospacing="1" w:line="240" w:lineRule="auto"/>
-        <w:outlineLvl w:val="2"/>
-        <w:rPr>
-          <w:rFonts w:ascii="Times New Roman" w:eastAsia="Times New Roman" w:hAnsi="Times New Roman" w:cs="Times New Roman"/>
-          <w:b/>
-          <w:bCs/>
-          <w:sz w:val="27"/>
-          <w:szCs w:val="27"/>
-          <w:lang w:eastAsia="tr-TR"/>
-        </w:rPr>
-      </w:pPr>
-      <w:r>
-        <w:rPr>
-          <w:rFonts w:ascii="Times New Roman" w:eastAsia="Times New Roman" w:hAnsi="Times New Roman" w:cs="Times New Roman"/>
-          <w:b/>
-          <w:bCs/>
-          <w:sz w:val="27"/>
-          <w:szCs w:val="27"/>
-          <w:lang w:eastAsia="tr-TR"/>
-        </w:rPr>
-        <w:t>4. Kullanılacak Teknolojiler</w:t>
-      </w:r>
-    </w:p>
-    <w:p>
-      <w:pPr>
+        <w:pStyle w:val="Balk3"/>
+      </w:pPr>
+      <w:r>
+        <w:t>4. Kullanılacak Teknolojiler ve Teknik Mimari</w:t>
+      </w:r>
+    </w:p>
+    <w:p>
+      <w:pPr>
+        <w:pStyle w:val="NormalWeb"/>
+      </w:pPr>
+      <w:r>
+        <w:t>Projenin teknoloji yığını (</w:t>
+      </w:r>
+      <w:proofErr w:type="spellStart"/>
+      <w:r>
+        <w:t>stack</w:t>
+      </w:r>
+      <w:proofErr w:type="spellEnd"/>
+      <w:r>
+        <w:t>), yüksek performanslı veri işleme ve güvenli kimlik doğrulama standartları gözetilerek seçilmiştir:</w:t>
+      </w:r>
+    </w:p>
+    <w:p>
+      <w:pPr>
+        <w:pStyle w:val="NormalWeb"/>
         <w:numPr>
           <w:ilvl w:val="0"/>
-          <w:numId w:val="3"/>
+          <w:numId w:val="4"/>
         </w:numPr>
-        <w:spacing w:before="100" w:beforeAutospacing="1" w:after="100" w:afterAutospacing="1" w:line="240" w:lineRule="auto"/>
-        <w:rPr>
-          <w:rFonts w:ascii="Times New Roman" w:eastAsia="Times New Roman" w:hAnsi="Times New Roman" w:cs="Times New Roman"/>
-          <w:sz w:val="24"/>
-          <w:szCs w:val="24"/>
-          <w:lang w:eastAsia="tr-TR"/>
-        </w:rPr>
       </w:pPr>
       <w:proofErr w:type="spellStart"/>
       <w:r>
         <w:rPr>
-          <w:rFonts w:ascii="Times New Roman" w:eastAsia="Times New Roman" w:hAnsi="Times New Roman" w:cs="Times New Roman"/>
-          <w:b/>
-          <w:bCs/>
-          <w:sz w:val="24"/>
-          <w:szCs w:val="24"/>
-          <w:lang w:eastAsia="tr-TR"/>
+          <w:b/>
+          <w:bCs/>
         </w:rPr>
         <w:t>Backend</w:t>
       </w:r>
       <w:proofErr w:type="spellEnd"/>
       <w:r>
         <w:rPr>
-          <w:rFonts w:ascii="Times New Roman" w:eastAsia="Times New Roman" w:hAnsi="Times New Roman" w:cs="Times New Roman"/>
-          <w:b/>
-          <w:bCs/>
-          <w:sz w:val="24"/>
-          <w:szCs w:val="24"/>
-          <w:lang w:eastAsia="tr-TR"/>
-        </w:rPr>
-        <w:t xml:space="preserve"> (Sunucu ve API):</w:t>
-      </w:r>
-      <w:r>
-        <w:rPr>
-          <w:rFonts w:ascii="Times New Roman" w:eastAsia="Times New Roman" w:hAnsi="Times New Roman" w:cs="Times New Roman"/>
-          <w:sz w:val="24"/>
-          <w:szCs w:val="24"/>
-          <w:lang w:eastAsia="tr-TR"/>
-        </w:rPr>
+          <w:b/>
+          <w:bCs/>
+        </w:rPr>
+        <w:t xml:space="preserve"> (Sunucu ve API Yönetimi):</w:t>
+      </w:r>
+    </w:p>
+    <w:p>
+      <w:pPr>
+        <w:pStyle w:val="NormalWeb"/>
+        <w:numPr>
+          <w:ilvl w:val="1"/>
+          <w:numId w:val="4"/>
+        </w:numPr>
+      </w:pPr>
+      <w:proofErr w:type="gramStart"/>
+      <w:r>
+        <w:rPr>
+          <w:b/>
+          <w:bCs/>
+        </w:rPr>
+        <w:t>Node.js</w:t>
+      </w:r>
+      <w:proofErr w:type="gramEnd"/>
+      <w:r>
+        <w:rPr>
+          <w:b/>
+          <w:bCs/>
+        </w:rPr>
+        <w:t xml:space="preserve"> &amp; Express.js:</w:t>
+      </w:r>
+      <w:r>
+        <w:t xml:space="preserve"> Asenkron yapısı sayesinde aynı anda gelen çok sayıda ilan talebini ve AI sorgusunu takılmadan işlemek için tercih edilmiştir.</w:t>
+      </w:r>
+    </w:p>
+    <w:p>
+      <w:pPr>
+        <w:pStyle w:val="NormalWeb"/>
+        <w:numPr>
+          <w:ilvl w:val="1"/>
+          <w:numId w:val="4"/>
+        </w:numPr>
+      </w:pPr>
+      <w:proofErr w:type="spellStart"/>
+      <w:r>
+        <w:rPr>
+          <w:b/>
+          <w:bCs/>
+        </w:rPr>
+        <w:t>pg</w:t>
+      </w:r>
+      <w:proofErr w:type="spellEnd"/>
+      <w:r>
+        <w:rPr>
+          <w:b/>
+          <w:bCs/>
+        </w:rPr>
+        <w:t xml:space="preserve"> (</w:t>
+      </w:r>
+      <w:proofErr w:type="spellStart"/>
+      <w:r>
+        <w:rPr>
+          <w:b/>
+          <w:bCs/>
+        </w:rPr>
+        <w:t>node-postgres</w:t>
+      </w:r>
+      <w:proofErr w:type="spellEnd"/>
+      <w:r>
+        <w:rPr>
+          <w:b/>
+          <w:bCs/>
+        </w:rPr>
+        <w:t>):</w:t>
+      </w:r>
+      <w:r>
         <w:t xml:space="preserve"> </w:t>
       </w:r>
-      <w:proofErr w:type="gramStart"/>
-      <w:r>
-        <w:rPr>
-          <w:rFonts w:ascii="Times New Roman" w:eastAsia="Times New Roman" w:hAnsi="Times New Roman" w:cs="Times New Roman"/>
-          <w:sz w:val="24"/>
-          <w:szCs w:val="24"/>
-          <w:lang w:eastAsia="tr-TR"/>
-        </w:rPr>
-        <w:t>Node.js</w:t>
-      </w:r>
-      <w:proofErr w:type="gramEnd"/>
-      <w:r>
-        <w:rPr>
-          <w:rFonts w:ascii="Times New Roman" w:eastAsia="Times New Roman" w:hAnsi="Times New Roman" w:cs="Times New Roman"/>
-          <w:sz w:val="24"/>
-          <w:szCs w:val="24"/>
-          <w:lang w:eastAsia="tr-TR"/>
-        </w:rPr>
-        <w:t xml:space="preserve"> (Express.js)</w:t>
-      </w:r>
-    </w:p>
-    <w:p>
-      <w:pPr>
+      <w:proofErr w:type="spellStart"/>
+      <w:r>
+        <w:t>PostgreSQL</w:t>
+      </w:r>
+      <w:proofErr w:type="spellEnd"/>
+      <w:r>
+        <w:t xml:space="preserve"> </w:t>
+      </w:r>
+      <w:proofErr w:type="spellStart"/>
+      <w:r>
+        <w:t>veritabanı</w:t>
+      </w:r>
+      <w:proofErr w:type="spellEnd"/>
+      <w:r>
+        <w:t xml:space="preserve"> ile sunucu arasında yüksek performanslı bir köprü kurmak ve "Connection </w:t>
+      </w:r>
+      <w:proofErr w:type="spellStart"/>
+      <w:r>
+        <w:t>Pooling</w:t>
+      </w:r>
+      <w:proofErr w:type="spellEnd"/>
+      <w:r>
+        <w:t>" (Bağlantı Havuzu) yönetimi için kullanılmıştır.</w:t>
+      </w:r>
+    </w:p>
+    <w:p>
+      <w:pPr>
+        <w:pStyle w:val="NormalWeb"/>
+      </w:pPr>
+      <w:r>
+        <w:rPr>
+          <w:rFonts w:hAnsi="Symbol"/>
+        </w:rPr>
+        <w:t></w:t>
+      </w:r>
+      <w:r>
+        <w:t xml:space="preserve">  </w:t>
+      </w:r>
+      <w:proofErr w:type="spellStart"/>
+      <w:r>
+        <w:rPr>
+          <w:b/>
+          <w:bCs/>
+        </w:rPr>
+        <w:t>Veritabanı</w:t>
+      </w:r>
+      <w:proofErr w:type="spellEnd"/>
+      <w:r>
+        <w:rPr>
+          <w:b/>
+          <w:bCs/>
+        </w:rPr>
+        <w:t xml:space="preserve"> (Veri Yönetimi):</w:t>
+      </w:r>
+    </w:p>
+    <w:p>
+      <w:pPr>
+        <w:pStyle w:val="NormalWeb"/>
         <w:numPr>
           <w:ilvl w:val="0"/>
-          <w:numId w:val="3"/>
+          <w:numId w:val="5"/>
         </w:numPr>
-        <w:spacing w:before="100" w:beforeAutospacing="1" w:after="100" w:afterAutospacing="1" w:line="240" w:lineRule="auto"/>
-        <w:rPr>
-          <w:rFonts w:ascii="Times New Roman" w:eastAsia="Times New Roman" w:hAnsi="Times New Roman" w:cs="Times New Roman"/>
-          <w:sz w:val="24"/>
-          <w:szCs w:val="24"/>
-          <w:lang w:eastAsia="tr-TR"/>
-        </w:rPr>
       </w:pPr>
       <w:proofErr w:type="spellStart"/>
       <w:r>
         <w:rPr>
-          <w:rFonts w:ascii="Times New Roman" w:eastAsia="Times New Roman" w:hAnsi="Times New Roman" w:cs="Times New Roman"/>
-          <w:b/>
-          <w:bCs/>
-          <w:sz w:val="24"/>
-          <w:szCs w:val="24"/>
-          <w:lang w:eastAsia="tr-TR"/>
-        </w:rPr>
-        <w:t>Veritabanı</w:t>
+          <w:b/>
+          <w:bCs/>
+        </w:rPr>
+        <w:t>PostgreSQL</w:t>
       </w:r>
       <w:proofErr w:type="spellEnd"/>
       <w:r>
         <w:rPr>
-          <w:rFonts w:ascii="Times New Roman" w:eastAsia="Times New Roman" w:hAnsi="Times New Roman" w:cs="Times New Roman"/>
-          <w:b/>
-          <w:bCs/>
-          <w:sz w:val="24"/>
-          <w:szCs w:val="24"/>
-          <w:lang w:eastAsia="tr-TR"/>
+          <w:b/>
+          <w:bCs/>
         </w:rPr>
         <w:t>:</w:t>
       </w:r>
       <w:r>
-        <w:rPr>
-          <w:rFonts w:ascii="Times New Roman" w:eastAsia="Times New Roman" w:hAnsi="Times New Roman" w:cs="Times New Roman"/>
-          <w:sz w:val="24"/>
-          <w:szCs w:val="24"/>
-          <w:lang w:eastAsia="tr-TR"/>
-        </w:rPr>
+        <w:t xml:space="preserve"> İlişkisel veri modeli sayesinde </w:t>
+      </w:r>
+      <w:proofErr w:type="gramStart"/>
+      <w:r>
+        <w:t>dükkan</w:t>
+      </w:r>
+      <w:proofErr w:type="gramEnd"/>
+      <w:r>
+        <w:t>, kullanıcı ve ilanlar arasındaki karmaşık bağlantıları (</w:t>
+      </w:r>
+      <w:proofErr w:type="spellStart"/>
+      <w:r>
+        <w:t>Foreign</w:t>
+      </w:r>
+      <w:proofErr w:type="spellEnd"/>
+      <w:r>
         <w:t xml:space="preserve"> </w:t>
       </w:r>
       <w:proofErr w:type="spellStart"/>
       <w:r>
-        <w:rPr>
-          <w:rFonts w:ascii="Times New Roman" w:eastAsia="Times New Roman" w:hAnsi="Times New Roman" w:cs="Times New Roman"/>
-          <w:sz w:val="24"/>
-          <w:szCs w:val="24"/>
-          <w:lang w:eastAsia="tr-TR"/>
-        </w:rPr>
-        <w:t>PostgreSQL</w:t>
+        <w:t>Keys</w:t>
       </w:r>
       <w:proofErr w:type="spellEnd"/>
       <w:r>
-        <w:rPr>
-          <w:rFonts w:ascii="Times New Roman" w:eastAsia="Times New Roman" w:hAnsi="Times New Roman" w:cs="Times New Roman"/>
-          <w:sz w:val="24"/>
-          <w:szCs w:val="24"/>
-          <w:lang w:eastAsia="tr-TR"/>
-        </w:rPr>
-        <w:t xml:space="preserve"> (İlişkisel mimari, rol yönetimi ve konum </w:t>
-      </w:r>
-      <w:proofErr w:type="gramStart"/>
-      <w:r>
-        <w:rPr>
-          <w:rFonts w:ascii="Times New Roman" w:eastAsia="Times New Roman" w:hAnsi="Times New Roman" w:cs="Times New Roman"/>
-          <w:sz w:val="24"/>
-          <w:szCs w:val="24"/>
-          <w:lang w:eastAsia="tr-TR"/>
-        </w:rPr>
-        <w:t>bazlı</w:t>
-      </w:r>
-      <w:proofErr w:type="gramEnd"/>
-      <w:r>
-        <w:rPr>
-          <w:rFonts w:ascii="Times New Roman" w:eastAsia="Times New Roman" w:hAnsi="Times New Roman" w:cs="Times New Roman"/>
-          <w:sz w:val="24"/>
-          <w:szCs w:val="24"/>
-          <w:lang w:eastAsia="tr-TR"/>
-        </w:rPr>
-        <w:t xml:space="preserve"> sorgular için)</w:t>
-      </w:r>
-    </w:p>
-    <w:p>
-      <w:pPr>
+        <w:t>) yönetmek için kullanılmıştır.</w:t>
+      </w:r>
+    </w:p>
+    <w:p>
+      <w:pPr>
+        <w:pStyle w:val="NormalWeb"/>
         <w:numPr>
           <w:ilvl w:val="0"/>
-          <w:numId w:val="3"/>
+          <w:numId w:val="5"/>
         </w:numPr>
-        <w:spacing w:before="100" w:beforeAutospacing="1" w:after="100" w:afterAutospacing="1" w:line="240" w:lineRule="auto"/>
-        <w:rPr>
-          <w:rFonts w:ascii="Times New Roman" w:eastAsia="Times New Roman" w:hAnsi="Times New Roman" w:cs="Times New Roman"/>
-          <w:sz w:val="24"/>
-          <w:szCs w:val="24"/>
-          <w:lang w:eastAsia="tr-TR"/>
-        </w:rPr>
-      </w:pPr>
-      <w:r>
-        <w:rPr>
-          <w:rFonts w:ascii="Times New Roman" w:eastAsia="Times New Roman" w:hAnsi="Times New Roman" w:cs="Times New Roman"/>
-          <w:b/>
-          <w:bCs/>
-          <w:sz w:val="24"/>
-          <w:szCs w:val="24"/>
-          <w:lang w:eastAsia="tr-TR"/>
-        </w:rPr>
-        <w:t xml:space="preserve">Web </w:t>
-      </w:r>
+      </w:pPr>
       <w:proofErr w:type="spellStart"/>
       <w:r>
         <w:rPr>
-          <w:rFonts w:ascii="Times New Roman" w:eastAsia="Times New Roman" w:hAnsi="Times New Roman" w:cs="Times New Roman"/>
-          <w:b/>
-          <w:bCs/>
-          <w:sz w:val="24"/>
-          <w:szCs w:val="24"/>
-          <w:lang w:eastAsia="tr-TR"/>
+          <w:b/>
+          <w:bCs/>
+        </w:rPr>
+        <w:t>DBeaver</w:t>
+      </w:r>
+      <w:proofErr w:type="spellEnd"/>
+      <w:r>
+        <w:rPr>
+          <w:b/>
+          <w:bCs/>
+        </w:rPr>
+        <w:t>:</w:t>
+      </w:r>
+      <w:r>
+        <w:t xml:space="preserve"> </w:t>
+      </w:r>
+      <w:proofErr w:type="spellStart"/>
+      <w:r>
+        <w:t>Veritabanı</w:t>
+      </w:r>
+      <w:proofErr w:type="spellEnd"/>
+      <w:r>
+        <w:t xml:space="preserve"> şemasının görselleştirilmesi, ER diyagramlarının oluşturulması ve SQL sorgularının test edilmesi için ana yönetim aracıdır.</w:t>
+      </w:r>
+    </w:p>
+    <w:p>
+      <w:pPr>
+        <w:pStyle w:val="NormalWeb"/>
+      </w:pPr>
+      <w:r>
+        <w:rPr>
+          <w:rFonts w:hAnsi="Symbol"/>
+        </w:rPr>
+        <w:t></w:t>
+      </w:r>
+      <w:r>
+        <w:t xml:space="preserve">  </w:t>
+      </w:r>
+      <w:proofErr w:type="spellStart"/>
+      <w:r>
+        <w:rPr>
+          <w:b/>
+          <w:bCs/>
         </w:rPr>
         <w:t>Frontend</w:t>
       </w:r>
       <w:proofErr w:type="spellEnd"/>
       <w:r>
         <w:rPr>
-          <w:rFonts w:ascii="Times New Roman" w:eastAsia="Times New Roman" w:hAnsi="Times New Roman" w:cs="Times New Roman"/>
-          <w:b/>
-          <w:bCs/>
-          <w:sz w:val="24"/>
-          <w:szCs w:val="24"/>
-          <w:lang w:eastAsia="tr-TR"/>
-        </w:rPr>
-        <w:t xml:space="preserve"> (Yönetim Paneli ve Vitrin):</w:t>
-      </w:r>
-      <w:r>
-        <w:rPr>
-          <w:rFonts w:ascii="Times New Roman" w:eastAsia="Times New Roman" w:hAnsi="Times New Roman" w:cs="Times New Roman"/>
-          <w:sz w:val="24"/>
-          <w:szCs w:val="24"/>
-          <w:lang w:eastAsia="tr-TR"/>
-        </w:rPr>
-        <w:t xml:space="preserve"> </w:t>
-      </w:r>
-      <w:proofErr w:type="gramStart"/>
-      <w:r>
-        <w:rPr>
-          <w:rFonts w:ascii="Times New Roman" w:eastAsia="Times New Roman" w:hAnsi="Times New Roman" w:cs="Times New Roman"/>
-          <w:sz w:val="24"/>
-          <w:szCs w:val="24"/>
-          <w:lang w:eastAsia="tr-TR"/>
-        </w:rPr>
-        <w:t>React.js</w:t>
-      </w:r>
-      <w:proofErr w:type="gramEnd"/>
-    </w:p>
-    <w:p>
-      <w:pPr>
+          <w:b/>
+          <w:bCs/>
+        </w:rPr>
+        <w:t xml:space="preserve"> (Kullanıcı </w:t>
+      </w:r>
+      <w:proofErr w:type="spellStart"/>
+      <w:r>
+        <w:rPr>
+          <w:b/>
+          <w:bCs/>
+        </w:rPr>
+        <w:t>Arayüzü</w:t>
+      </w:r>
+      <w:proofErr w:type="spellEnd"/>
+      <w:r>
+        <w:rPr>
+          <w:b/>
+          <w:bCs/>
+        </w:rPr>
+        <w:t>):</w:t>
+      </w:r>
+    </w:p>
+    <w:p>
+      <w:pPr>
+        <w:pStyle w:val="NormalWeb"/>
         <w:numPr>
           <w:ilvl w:val="0"/>
-          <w:numId w:val="3"/>
+          <w:numId w:val="6"/>
         </w:numPr>
-        <w:spacing w:before="100" w:beforeAutospacing="1" w:after="100" w:afterAutospacing="1" w:line="240" w:lineRule="auto"/>
-        <w:rPr>
-          <w:rFonts w:ascii="Times New Roman" w:eastAsia="Times New Roman" w:hAnsi="Times New Roman" w:cs="Times New Roman"/>
-          <w:sz w:val="24"/>
-          <w:szCs w:val="24"/>
-          <w:lang w:eastAsia="tr-TR"/>
-        </w:rPr>
-      </w:pPr>
-      <w:r>
-        <w:rPr>
-          <w:rFonts w:ascii="Times New Roman" w:eastAsia="Times New Roman" w:hAnsi="Times New Roman" w:cs="Times New Roman"/>
-          <w:b/>
-          <w:bCs/>
-          <w:sz w:val="24"/>
-          <w:szCs w:val="24"/>
-          <w:lang w:eastAsia="tr-TR"/>
-        </w:rPr>
-        <w:t>Mobil Uygulama (Saha Asistanı):</w:t>
-      </w:r>
-      <w:r>
-        <w:rPr>
-          <w:rFonts w:ascii="Times New Roman" w:eastAsia="Times New Roman" w:hAnsi="Times New Roman" w:cs="Times New Roman"/>
-          <w:sz w:val="24"/>
-          <w:szCs w:val="24"/>
-          <w:lang w:eastAsia="tr-TR"/>
-        </w:rPr>
-        <w:t xml:space="preserve"> </w:t>
+      </w:pPr>
+      <w:proofErr w:type="gramStart"/>
+      <w:r>
+        <w:rPr>
+          <w:b/>
+          <w:bCs/>
+        </w:rPr>
+        <w:t>React.js</w:t>
+      </w:r>
+      <w:proofErr w:type="gramEnd"/>
+      <w:r>
+        <w:rPr>
+          <w:b/>
+          <w:bCs/>
+        </w:rPr>
+        <w:t xml:space="preserve"> (Web):</w:t>
+      </w:r>
+      <w:r>
+        <w:t xml:space="preserve"> Emlakçıların ilanlarını yönettiği ve müşterilerin filtreleme yaptığı dinamik </w:t>
       </w:r>
       <w:proofErr w:type="spellStart"/>
       <w:r>
-        <w:rPr>
-          <w:rFonts w:ascii="Times New Roman" w:eastAsia="Times New Roman" w:hAnsi="Times New Roman" w:cs="Times New Roman"/>
-          <w:sz w:val="24"/>
-          <w:szCs w:val="24"/>
-          <w:lang w:eastAsia="tr-TR"/>
-        </w:rPr>
-        <w:t>React</w:t>
+        <w:t>arayüzlerin</w:t>
       </w:r>
       <w:proofErr w:type="spellEnd"/>
       <w:r>
-        <w:rPr>
-          <w:rFonts w:ascii="Times New Roman" w:eastAsia="Times New Roman" w:hAnsi="Times New Roman" w:cs="Times New Roman"/>
-          <w:sz w:val="24"/>
-          <w:szCs w:val="24"/>
-          <w:lang w:eastAsia="tr-TR"/>
-        </w:rPr>
-        <w:t xml:space="preserve"> </w:t>
-      </w:r>
-      <w:proofErr w:type="spellStart"/>
-      <w:r>
-        <w:rPr>
-          <w:rFonts w:ascii="Times New Roman" w:eastAsia="Times New Roman" w:hAnsi="Times New Roman" w:cs="Times New Roman"/>
-          <w:sz w:val="24"/>
-          <w:szCs w:val="24"/>
-          <w:lang w:eastAsia="tr-TR"/>
-        </w:rPr>
-        <w:t>Native</w:t>
-      </w:r>
-      <w:proofErr w:type="spellEnd"/>
-    </w:p>
-    <w:p>
-      <w:pPr>
+        <w:t xml:space="preserve"> geliştirilmesi için kullanılacaktır.</w:t>
+      </w:r>
+    </w:p>
+    <w:p>
+      <w:pPr>
+        <w:pStyle w:val="NormalWeb"/>
         <w:numPr>
           <w:ilvl w:val="0"/>
-          <w:numId w:val="3"/>
+          <w:numId w:val="6"/>
         </w:numPr>
-        <w:spacing w:before="100" w:beforeAutospacing="1" w:after="100" w:afterAutospacing="1" w:line="240" w:lineRule="auto"/>
-        <w:rPr>
-          <w:rFonts w:ascii="Times New Roman" w:eastAsia="Times New Roman" w:hAnsi="Times New Roman" w:cs="Times New Roman"/>
-          <w:sz w:val="24"/>
-          <w:szCs w:val="24"/>
-          <w:lang w:eastAsia="tr-TR"/>
-        </w:rPr>
-      </w:pPr>
-      <w:r>
-        <w:rPr>
-          <w:rFonts w:ascii="Times New Roman" w:eastAsia="Times New Roman" w:hAnsi="Times New Roman" w:cs="Times New Roman"/>
-          <w:b/>
-          <w:bCs/>
-          <w:sz w:val="24"/>
-          <w:szCs w:val="24"/>
-          <w:lang w:eastAsia="tr-TR"/>
-        </w:rPr>
-        <w:t>Harici Servisler:</w:t>
-      </w:r>
-      <w:r>
-        <w:rPr>
-          <w:rFonts w:ascii="Times New Roman" w:eastAsia="Times New Roman" w:hAnsi="Times New Roman" w:cs="Times New Roman"/>
-          <w:sz w:val="24"/>
-          <w:szCs w:val="24"/>
-          <w:lang w:eastAsia="tr-TR"/>
-        </w:rPr>
-        <w:t xml:space="preserve"> Metin, fiyat tahmini ve asistan </w:t>
-      </w:r>
+      </w:pPr>
       <w:proofErr w:type="spellStart"/>
       <w:r>
         <w:rPr>
-          <w:rFonts w:ascii="Times New Roman" w:eastAsia="Times New Roman" w:hAnsi="Times New Roman" w:cs="Times New Roman"/>
-          <w:sz w:val="24"/>
-          <w:szCs w:val="24"/>
-          <w:lang w:eastAsia="tr-TR"/>
-        </w:rPr>
+          <w:b/>
+          <w:bCs/>
+        </w:rPr>
+        <w:t>React</w:t>
+      </w:r>
+      <w:proofErr w:type="spellEnd"/>
+      <w:r>
+        <w:rPr>
+          <w:b/>
+          <w:bCs/>
+        </w:rPr>
+        <w:t xml:space="preserve"> </w:t>
+      </w:r>
+      <w:proofErr w:type="spellStart"/>
+      <w:r>
+        <w:rPr>
+          <w:b/>
+          <w:bCs/>
+        </w:rPr>
+        <w:t>Native</w:t>
+      </w:r>
+      <w:proofErr w:type="spellEnd"/>
+      <w:r>
+        <w:rPr>
+          <w:b/>
+          <w:bCs/>
+        </w:rPr>
+        <w:t xml:space="preserve"> (Mobil):</w:t>
+      </w:r>
+      <w:r>
+        <w:t xml:space="preserve"> Saha danışmanlarının telefon üzerinden hızlıca fotoğraf ve GPS konumu yükleyebilmesi için tercih edilmiştir.</w:t>
+      </w:r>
+    </w:p>
+    <w:p>
+      <w:pPr>
+        <w:pStyle w:val="NormalWeb"/>
+      </w:pPr>
+    </w:p>
+    <w:p>
+      <w:pPr>
+        <w:pStyle w:val="NormalWeb"/>
+      </w:pPr>
+    </w:p>
+    <w:p>
+      <w:pPr>
+        <w:pStyle w:val="Balk3"/>
+      </w:pPr>
+      <w:r>
+        <w:t>5. Öne Çıkan Özellikler</w:t>
+      </w:r>
+    </w:p>
+    <w:p>
+      <w:pPr>
+        <w:pStyle w:val="NormalWeb"/>
+        <w:numPr>
+          <w:ilvl w:val="0"/>
+          <w:numId w:val="7"/>
+        </w:numPr>
+      </w:pPr>
+      <w:r>
+        <w:rPr>
+          <w:b/>
+          <w:bCs/>
+        </w:rPr>
+        <w:t>AI Değerleme &amp; Asistan:</w:t>
+      </w:r>
+      <w:r>
+        <w:t xml:space="preserve"> Müşteriler mülk verilerini girerek yapay </w:t>
+      </w:r>
+      <w:proofErr w:type="gramStart"/>
+      <w:r>
+        <w:t>zeka</w:t>
+      </w:r>
+      <w:proofErr w:type="gramEnd"/>
+      <w:r>
+        <w:t xml:space="preserve"> üzerinden piyasa analizi alabilir. </w:t>
+      </w:r>
+      <w:proofErr w:type="spellStart"/>
+      <w:r>
         <w:t>Chatbot</w:t>
       </w:r>
       <w:proofErr w:type="spellEnd"/>
       <w:r>
-        <w:rPr>
-          <w:rFonts w:ascii="Times New Roman" w:eastAsia="Times New Roman" w:hAnsi="Times New Roman" w:cs="Times New Roman"/>
-          <w:sz w:val="24"/>
-          <w:szCs w:val="24"/>
-          <w:lang w:eastAsia="tr-TR"/>
-        </w:rPr>
-        <w:t xml:space="preserve"> özellikleri için AI API (</w:t>
+        <w:t xml:space="preserve"> asistanı, doğal dildeki ("Merkez'de 3 milyon TL altı balkonlu evler") talepleri anlar ve filtreler.</w:t>
+      </w:r>
+    </w:p>
+    <w:p>
+      <w:pPr>
+        <w:pStyle w:val="NormalWeb"/>
+        <w:numPr>
+          <w:ilvl w:val="0"/>
+          <w:numId w:val="7"/>
+        </w:numPr>
+      </w:pPr>
+      <w:r>
+        <w:rPr>
+          <w:b/>
+          <w:bCs/>
+        </w:rPr>
+        <w:t>Konum Bazlı Filtreleme:</w:t>
+      </w:r>
+      <w:r>
+        <w:t xml:space="preserve"> İlanlar harita üzerinde </w:t>
       </w:r>
       <w:proofErr w:type="spellStart"/>
       <w:r>
-        <w:rPr>
-          <w:rFonts w:ascii="Times New Roman" w:eastAsia="Times New Roman" w:hAnsi="Times New Roman" w:cs="Times New Roman"/>
-          <w:sz w:val="24"/>
-          <w:szCs w:val="24"/>
-          <w:lang w:eastAsia="tr-TR"/>
-        </w:rPr>
-        <w:t>Claude</w:t>
+        <w:t>pinler</w:t>
       </w:r>
       <w:proofErr w:type="spellEnd"/>
       <w:r>
-        <w:rPr>
-          <w:rFonts w:ascii="Times New Roman" w:eastAsia="Times New Roman" w:hAnsi="Times New Roman" w:cs="Times New Roman"/>
-          <w:sz w:val="24"/>
-          <w:szCs w:val="24"/>
-          <w:lang w:eastAsia="tr-TR"/>
-        </w:rPr>
-        <w:t>/</w:t>
-      </w:r>
-      <w:proofErr w:type="spellStart"/>
-      <w:r>
-        <w:rPr>
-          <w:rFonts w:ascii="Times New Roman" w:eastAsia="Times New Roman" w:hAnsi="Times New Roman" w:cs="Times New Roman"/>
-          <w:sz w:val="24"/>
-          <w:szCs w:val="24"/>
-          <w:lang w:eastAsia="tr-TR"/>
-        </w:rPr>
-        <w:t>OpenAI</w:t>
-      </w:r>
-      <w:proofErr w:type="spellEnd"/>
-      <w:r>
-        <w:rPr>
-          <w:rFonts w:ascii="Times New Roman" w:eastAsia="Times New Roman" w:hAnsi="Times New Roman" w:cs="Times New Roman"/>
-          <w:sz w:val="24"/>
-          <w:szCs w:val="24"/>
-          <w:lang w:eastAsia="tr-TR"/>
-        </w:rPr>
-        <w:t xml:space="preserve">/Gemini); konumlandırma ve harita çizimi için </w:t>
-      </w:r>
-      <w:proofErr w:type="spellStart"/>
-      <w:r>
-        <w:rPr>
-          <w:rFonts w:ascii="Times New Roman" w:eastAsia="Times New Roman" w:hAnsi="Times New Roman" w:cs="Times New Roman"/>
-          <w:sz w:val="24"/>
-          <w:szCs w:val="24"/>
-          <w:lang w:eastAsia="tr-TR"/>
-        </w:rPr>
-        <w:t>Map</w:t>
-      </w:r>
-      <w:proofErr w:type="spellEnd"/>
-      <w:r>
-        <w:rPr>
-          <w:rFonts w:ascii="Times New Roman" w:eastAsia="Times New Roman" w:hAnsi="Times New Roman" w:cs="Times New Roman"/>
-          <w:sz w:val="24"/>
-          <w:szCs w:val="24"/>
-          <w:lang w:eastAsia="tr-TR"/>
-        </w:rPr>
-        <w:t xml:space="preserve"> API.</w:t>
+        <w:t xml:space="preserve"> şeklinde gösterilir. </w:t>
+      </w:r>
+      <w:proofErr w:type="gramStart"/>
+      <w:r>
+        <w:t>Node.js</w:t>
+      </w:r>
+      <w:proofErr w:type="gramEnd"/>
+      <w:r>
+        <w:t xml:space="preserve"> tarafında yazılan algoritmalarla sadece o bölgedeki ilanlar hızlıca çekilir.</w:t>
+      </w:r>
+    </w:p>
+    <w:p>
+      <w:pPr>
+        <w:pStyle w:val="NormalWeb"/>
+        <w:numPr>
+          <w:ilvl w:val="0"/>
+          <w:numId w:val="7"/>
+        </w:numPr>
+      </w:pPr>
+      <w:r>
+        <w:rPr>
+          <w:b/>
+          <w:bCs/>
+        </w:rPr>
+        <w:t>Talep Havuzu:</w:t>
+      </w:r>
+      <w:r>
+        <w:t xml:space="preserve"> Müşterinin "Evimi Sat" talebi, sistem tarafından otomatik olarak o bölgedeki yetkili emlak ofislerinin ekranına düşer.</w:t>
+      </w:r>
+    </w:p>
+    <w:p>
+      <w:pPr>
+        <w:pStyle w:val="NormalWeb"/>
+      </w:pPr>
+    </w:p>
+    <w:p>
+      <w:pPr>
+        <w:pStyle w:val="NormalWeb"/>
+      </w:pPr>
+    </w:p>
+    <w:p>
+      <w:pPr>
+        <w:pStyle w:val="NormalWeb"/>
+      </w:pPr>
+    </w:p>
+    <w:p>
+      <w:pPr>
+        <w:pStyle w:val="NormalWeb"/>
+        <w:rPr>
+          <w:b/>
+        </w:rPr>
+      </w:pPr>
+      <w:bookmarkStart w:id="0" w:name="_GoBack"/>
+      <w:r>
+        <w:rPr>
+          <w:b/>
+        </w:rPr>
+        <w:t>6</w:t>
+      </w:r>
+      <w:r>
+        <w:rPr>
+          <w:b/>
+        </w:rPr>
+        <w:t>. Güncel Proje Takvimi (İş Paketleri)</w:t>
+      </w:r>
+    </w:p>
+    <w:bookmarkEnd w:id="0"/>
+    <w:p>
+      <w:pPr>
+        <w:pStyle w:val="NormalWeb"/>
+        <w:rPr>
+          <w:b/>
+        </w:rPr>
+      </w:pPr>
+      <w:r>
+        <w:rPr>
+          <w:b/>
+          <w:noProof/>
+        </w:rPr>
+        <w:drawing>
+          <wp:inline distT="0" distB="0" distL="0" distR="0">
+            <wp:extent cx="5760720" cy="2325597"/>
+            <wp:effectExtent l="0" t="0" r="0" b="0"/>
+            <wp:docPr id="2" name="Resim 2" descr="C:\Users\Ahmet\Pictures\Screenshots\Ekran görüntüsü 2026-03-24 202717.png"/>
+            <wp:cNvGraphicFramePr>
+              <a:graphicFrameLocks xmlns:a="http://schemas.openxmlformats.org/drawingml/2006/main" noChangeAspect="1"/>
+            </wp:cNvGraphicFramePr>
+            <a:graphic xmlns:a="http://schemas.openxmlformats.org/drawingml/2006/main">
+              <a:graphicData uri="http://schemas.openxmlformats.org/drawingml/2006/picture">
+                <pic:pic xmlns:pic="http://schemas.openxmlformats.org/drawingml/2006/picture">
+                  <pic:nvPicPr>
+                    <pic:cNvPr id="0" name="Picture 1" descr="C:\Users\Ahmet\Pictures\Screenshots\Ekran görüntüsü 2026-03-24 202717.png"/>
+                    <pic:cNvPicPr>
+                      <a:picLocks noChangeAspect="1" noChangeArrowheads="1"/>
+                    </pic:cNvPicPr>
+                  </pic:nvPicPr>
+                  <pic:blipFill>
+                    <a:blip r:embed="rId5">
+                      <a:extLst>
+                        <a:ext uri="{28A0092B-C50C-407E-A947-70E740481C1C}">
+                          <a14:useLocalDpi xmlns:a14="http://schemas.microsoft.com/office/drawing/2010/main" val="0"/>
+                        </a:ext>
+                      </a:extLst>
+                    </a:blip>
+                    <a:srcRect/>
+                    <a:stretch>
+                      <a:fillRect/>
+                    </a:stretch>
+                  </pic:blipFill>
+                  <pic:spPr bwMode="auto">
+                    <a:xfrm>
+                      <a:off x="0" y="0"/>
+                      <a:ext cx="5760720" cy="2325597"/>
+                    </a:xfrm>
+                    <a:prstGeom prst="rect">
+                      <a:avLst/>
+                    </a:prstGeom>
+                    <a:noFill/>
+                    <a:ln>
+                      <a:noFill/>
+                    </a:ln>
+                  </pic:spPr>
+                </pic:pic>
+              </a:graphicData>
+            </a:graphic>
+          </wp:inline>
+        </w:drawing>
       </w:r>
     </w:p>
     <w:p/>
@@ -1517,6 +1678,453 @@
     </w:lvl>
   </w:abstractNum>
   <w:abstractNum w:abstractNumId="1" w15:restartNumberingAfterBreak="0">
+    <w:nsid w:val="17A37A30"/>
+    <w:multiLevelType w:val="multilevel"/>
+    <w:tmpl w:val="C0A64A44"/>
+    <w:lvl w:ilvl="0">
+      <w:start w:val="1"/>
+      <w:numFmt w:val="bullet"/>
+      <w:lvlText w:val=""/>
+      <w:lvlJc w:val="left"/>
+      <w:pPr>
+        <w:tabs>
+          <w:tab w:val="num" w:pos="720"/>
+        </w:tabs>
+        <w:ind w:left="720" w:hanging="360"/>
+      </w:pPr>
+      <w:rPr>
+        <w:rFonts w:ascii="Symbol" w:hAnsi="Symbol" w:hint="default"/>
+        <w:sz w:val="20"/>
+      </w:rPr>
+    </w:lvl>
+    <w:lvl w:ilvl="1" w:tentative="1">
+      <w:start w:val="1"/>
+      <w:numFmt w:val="bullet"/>
+      <w:lvlText w:val="o"/>
+      <w:lvlJc w:val="left"/>
+      <w:pPr>
+        <w:tabs>
+          <w:tab w:val="num" w:pos="1440"/>
+        </w:tabs>
+        <w:ind w:left="1440" w:hanging="360"/>
+      </w:pPr>
+      <w:rPr>
+        <w:rFonts w:ascii="Courier New" w:hAnsi="Courier New" w:hint="default"/>
+        <w:sz w:val="20"/>
+      </w:rPr>
+    </w:lvl>
+    <w:lvl w:ilvl="2" w:tentative="1">
+      <w:start w:val="1"/>
+      <w:numFmt w:val="bullet"/>
+      <w:lvlText w:val=""/>
+      <w:lvlJc w:val="left"/>
+      <w:pPr>
+        <w:tabs>
+          <w:tab w:val="num" w:pos="2160"/>
+        </w:tabs>
+        <w:ind w:left="2160" w:hanging="360"/>
+      </w:pPr>
+      <w:rPr>
+        <w:rFonts w:ascii="Wingdings" w:hAnsi="Wingdings" w:hint="default"/>
+        <w:sz w:val="20"/>
+      </w:rPr>
+    </w:lvl>
+    <w:lvl w:ilvl="3" w:tentative="1">
+      <w:start w:val="1"/>
+      <w:numFmt w:val="bullet"/>
+      <w:lvlText w:val=""/>
+      <w:lvlJc w:val="left"/>
+      <w:pPr>
+        <w:tabs>
+          <w:tab w:val="num" w:pos="2880"/>
+        </w:tabs>
+        <w:ind w:left="2880" w:hanging="360"/>
+      </w:pPr>
+      <w:rPr>
+        <w:rFonts w:ascii="Wingdings" w:hAnsi="Wingdings" w:hint="default"/>
+        <w:sz w:val="20"/>
+      </w:rPr>
+    </w:lvl>
+    <w:lvl w:ilvl="4" w:tentative="1">
+      <w:start w:val="1"/>
+      <w:numFmt w:val="bullet"/>
+      <w:lvlText w:val=""/>
+      <w:lvlJc w:val="left"/>
+      <w:pPr>
+        <w:tabs>
+          <w:tab w:val="num" w:pos="3600"/>
+        </w:tabs>
+        <w:ind w:left="3600" w:hanging="360"/>
+      </w:pPr>
+      <w:rPr>
+        <w:rFonts w:ascii="Wingdings" w:hAnsi="Wingdings" w:hint="default"/>
+        <w:sz w:val="20"/>
+      </w:rPr>
+    </w:lvl>
+    <w:lvl w:ilvl="5" w:tentative="1">
+      <w:start w:val="1"/>
+      <w:numFmt w:val="bullet"/>
+      <w:lvlText w:val=""/>
+      <w:lvlJc w:val="left"/>
+      <w:pPr>
+        <w:tabs>
+          <w:tab w:val="num" w:pos="4320"/>
+        </w:tabs>
+        <w:ind w:left="4320" w:hanging="360"/>
+      </w:pPr>
+      <w:rPr>
+        <w:rFonts w:ascii="Wingdings" w:hAnsi="Wingdings" w:hint="default"/>
+        <w:sz w:val="20"/>
+      </w:rPr>
+    </w:lvl>
+    <w:lvl w:ilvl="6" w:tentative="1">
+      <w:start w:val="1"/>
+      <w:numFmt w:val="bullet"/>
+      <w:lvlText w:val=""/>
+      <w:lvlJc w:val="left"/>
+      <w:pPr>
+        <w:tabs>
+          <w:tab w:val="num" w:pos="5040"/>
+        </w:tabs>
+        <w:ind w:left="5040" w:hanging="360"/>
+      </w:pPr>
+      <w:rPr>
+        <w:rFonts w:ascii="Wingdings" w:hAnsi="Wingdings" w:hint="default"/>
+        <w:sz w:val="20"/>
+      </w:rPr>
+    </w:lvl>
+    <w:lvl w:ilvl="7" w:tentative="1">
+      <w:start w:val="1"/>
+      <w:numFmt w:val="bullet"/>
+      <w:lvlText w:val=""/>
+      <w:lvlJc w:val="left"/>
+      <w:pPr>
+        <w:tabs>
+          <w:tab w:val="num" w:pos="5760"/>
+        </w:tabs>
+        <w:ind w:left="5760" w:hanging="360"/>
+      </w:pPr>
+      <w:rPr>
+        <w:rFonts w:ascii="Wingdings" w:hAnsi="Wingdings" w:hint="default"/>
+        <w:sz w:val="20"/>
+      </w:rPr>
+    </w:lvl>
+    <w:lvl w:ilvl="8" w:tentative="1">
+      <w:start w:val="1"/>
+      <w:numFmt w:val="bullet"/>
+      <w:lvlText w:val=""/>
+      <w:lvlJc w:val="left"/>
+      <w:pPr>
+        <w:tabs>
+          <w:tab w:val="num" w:pos="6480"/>
+        </w:tabs>
+        <w:ind w:left="6480" w:hanging="360"/>
+      </w:pPr>
+      <w:rPr>
+        <w:rFonts w:ascii="Wingdings" w:hAnsi="Wingdings" w:hint="default"/>
+        <w:sz w:val="20"/>
+      </w:rPr>
+    </w:lvl>
+  </w:abstractNum>
+  <w:abstractNum w:abstractNumId="2" w15:restartNumberingAfterBreak="0">
+    <w:nsid w:val="1AF43491"/>
+    <w:multiLevelType w:val="multilevel"/>
+    <w:tmpl w:val="C586426E"/>
+    <w:lvl w:ilvl="0">
+      <w:start w:val="1"/>
+      <w:numFmt w:val="bullet"/>
+      <w:lvlText w:val=""/>
+      <w:lvlJc w:val="left"/>
+      <w:pPr>
+        <w:tabs>
+          <w:tab w:val="num" w:pos="720"/>
+        </w:tabs>
+        <w:ind w:left="720" w:hanging="360"/>
+      </w:pPr>
+      <w:rPr>
+        <w:rFonts w:ascii="Symbol" w:hAnsi="Symbol" w:hint="default"/>
+        <w:sz w:val="20"/>
+      </w:rPr>
+    </w:lvl>
+    <w:lvl w:ilvl="1" w:tentative="1">
+      <w:start w:val="1"/>
+      <w:numFmt w:val="bullet"/>
+      <w:lvlText w:val="o"/>
+      <w:lvlJc w:val="left"/>
+      <w:pPr>
+        <w:tabs>
+          <w:tab w:val="num" w:pos="1440"/>
+        </w:tabs>
+        <w:ind w:left="1440" w:hanging="360"/>
+      </w:pPr>
+      <w:rPr>
+        <w:rFonts w:ascii="Courier New" w:hAnsi="Courier New" w:hint="default"/>
+        <w:sz w:val="20"/>
+      </w:rPr>
+    </w:lvl>
+    <w:lvl w:ilvl="2" w:tentative="1">
+      <w:start w:val="1"/>
+      <w:numFmt w:val="bullet"/>
+      <w:lvlText w:val=""/>
+      <w:lvlJc w:val="left"/>
+      <w:pPr>
+        <w:tabs>
+          <w:tab w:val="num" w:pos="2160"/>
+        </w:tabs>
+        <w:ind w:left="2160" w:hanging="360"/>
+      </w:pPr>
+      <w:rPr>
+        <w:rFonts w:ascii="Wingdings" w:hAnsi="Wingdings" w:hint="default"/>
+        <w:sz w:val="20"/>
+      </w:rPr>
+    </w:lvl>
+    <w:lvl w:ilvl="3" w:tentative="1">
+      <w:start w:val="1"/>
+      <w:numFmt w:val="bullet"/>
+      <w:lvlText w:val=""/>
+      <w:lvlJc w:val="left"/>
+      <w:pPr>
+        <w:tabs>
+          <w:tab w:val="num" w:pos="2880"/>
+        </w:tabs>
+        <w:ind w:left="2880" w:hanging="360"/>
+      </w:pPr>
+      <w:rPr>
+        <w:rFonts w:ascii="Wingdings" w:hAnsi="Wingdings" w:hint="default"/>
+        <w:sz w:val="20"/>
+      </w:rPr>
+    </w:lvl>
+    <w:lvl w:ilvl="4" w:tentative="1">
+      <w:start w:val="1"/>
+      <w:numFmt w:val="bullet"/>
+      <w:lvlText w:val=""/>
+      <w:lvlJc w:val="left"/>
+      <w:pPr>
+        <w:tabs>
+          <w:tab w:val="num" w:pos="3600"/>
+        </w:tabs>
+        <w:ind w:left="3600" w:hanging="360"/>
+      </w:pPr>
+      <w:rPr>
+        <w:rFonts w:ascii="Wingdings" w:hAnsi="Wingdings" w:hint="default"/>
+        <w:sz w:val="20"/>
+      </w:rPr>
+    </w:lvl>
+    <w:lvl w:ilvl="5" w:tentative="1">
+      <w:start w:val="1"/>
+      <w:numFmt w:val="bullet"/>
+      <w:lvlText w:val=""/>
+      <w:lvlJc w:val="left"/>
+      <w:pPr>
+        <w:tabs>
+          <w:tab w:val="num" w:pos="4320"/>
+        </w:tabs>
+        <w:ind w:left="4320" w:hanging="360"/>
+      </w:pPr>
+      <w:rPr>
+        <w:rFonts w:ascii="Wingdings" w:hAnsi="Wingdings" w:hint="default"/>
+        <w:sz w:val="20"/>
+      </w:rPr>
+    </w:lvl>
+    <w:lvl w:ilvl="6" w:tentative="1">
+      <w:start w:val="1"/>
+      <w:numFmt w:val="bullet"/>
+      <w:lvlText w:val=""/>
+      <w:lvlJc w:val="left"/>
+      <w:pPr>
+        <w:tabs>
+          <w:tab w:val="num" w:pos="5040"/>
+        </w:tabs>
+        <w:ind w:left="5040" w:hanging="360"/>
+      </w:pPr>
+      <w:rPr>
+        <w:rFonts w:ascii="Wingdings" w:hAnsi="Wingdings" w:hint="default"/>
+        <w:sz w:val="20"/>
+      </w:rPr>
+    </w:lvl>
+    <w:lvl w:ilvl="7" w:tentative="1">
+      <w:start w:val="1"/>
+      <w:numFmt w:val="bullet"/>
+      <w:lvlText w:val=""/>
+      <w:lvlJc w:val="left"/>
+      <w:pPr>
+        <w:tabs>
+          <w:tab w:val="num" w:pos="5760"/>
+        </w:tabs>
+        <w:ind w:left="5760" w:hanging="360"/>
+      </w:pPr>
+      <w:rPr>
+        <w:rFonts w:ascii="Wingdings" w:hAnsi="Wingdings" w:hint="default"/>
+        <w:sz w:val="20"/>
+      </w:rPr>
+    </w:lvl>
+    <w:lvl w:ilvl="8" w:tentative="1">
+      <w:start w:val="1"/>
+      <w:numFmt w:val="bullet"/>
+      <w:lvlText w:val=""/>
+      <w:lvlJc w:val="left"/>
+      <w:pPr>
+        <w:tabs>
+          <w:tab w:val="num" w:pos="6480"/>
+        </w:tabs>
+        <w:ind w:left="6480" w:hanging="360"/>
+      </w:pPr>
+      <w:rPr>
+        <w:rFonts w:ascii="Wingdings" w:hAnsi="Wingdings" w:hint="default"/>
+        <w:sz w:val="20"/>
+      </w:rPr>
+    </w:lvl>
+  </w:abstractNum>
+  <w:abstractNum w:abstractNumId="3" w15:restartNumberingAfterBreak="0">
+    <w:nsid w:val="3F852163"/>
+    <w:multiLevelType w:val="multilevel"/>
+    <w:tmpl w:val="01DA4440"/>
+    <w:lvl w:ilvl="0">
+      <w:start w:val="1"/>
+      <w:numFmt w:val="bullet"/>
+      <w:lvlText w:val=""/>
+      <w:lvlJc w:val="left"/>
+      <w:pPr>
+        <w:tabs>
+          <w:tab w:val="num" w:pos="720"/>
+        </w:tabs>
+        <w:ind w:left="720" w:hanging="360"/>
+      </w:pPr>
+      <w:rPr>
+        <w:rFonts w:ascii="Symbol" w:hAnsi="Symbol" w:hint="default"/>
+        <w:sz w:val="20"/>
+      </w:rPr>
+    </w:lvl>
+    <w:lvl w:ilvl="1" w:tentative="1">
+      <w:start w:val="1"/>
+      <w:numFmt w:val="bullet"/>
+      <w:lvlText w:val="o"/>
+      <w:lvlJc w:val="left"/>
+      <w:pPr>
+        <w:tabs>
+          <w:tab w:val="num" w:pos="1440"/>
+        </w:tabs>
+        <w:ind w:left="1440" w:hanging="360"/>
+      </w:pPr>
+      <w:rPr>
+        <w:rFonts w:ascii="Courier New" w:hAnsi="Courier New" w:hint="default"/>
+        <w:sz w:val="20"/>
+      </w:rPr>
+    </w:lvl>
+    <w:lvl w:ilvl="2" w:tentative="1">
+      <w:start w:val="1"/>
+      <w:numFmt w:val="bullet"/>
+      <w:lvlText w:val=""/>
+      <w:lvlJc w:val="left"/>
+      <w:pPr>
+        <w:tabs>
+          <w:tab w:val="num" w:pos="2160"/>
+        </w:tabs>
+        <w:ind w:left="2160" w:hanging="360"/>
+      </w:pPr>
+      <w:rPr>
+        <w:rFonts w:ascii="Wingdings" w:hAnsi="Wingdings" w:hint="default"/>
+        <w:sz w:val="20"/>
+      </w:rPr>
+    </w:lvl>
+    <w:lvl w:ilvl="3" w:tentative="1">
+      <w:start w:val="1"/>
+      <w:numFmt w:val="bullet"/>
+      <w:lvlText w:val=""/>
+      <w:lvlJc w:val="left"/>
+      <w:pPr>
+        <w:tabs>
+          <w:tab w:val="num" w:pos="2880"/>
+        </w:tabs>
+        <w:ind w:left="2880" w:hanging="360"/>
+      </w:pPr>
+      <w:rPr>
+        <w:rFonts w:ascii="Wingdings" w:hAnsi="Wingdings" w:hint="default"/>
+        <w:sz w:val="20"/>
+      </w:rPr>
+    </w:lvl>
+    <w:lvl w:ilvl="4" w:tentative="1">
+      <w:start w:val="1"/>
+      <w:numFmt w:val="bullet"/>
+      <w:lvlText w:val=""/>
+      <w:lvlJc w:val="left"/>
+      <w:pPr>
+        <w:tabs>
+          <w:tab w:val="num" w:pos="3600"/>
+        </w:tabs>
+        <w:ind w:left="3600" w:hanging="360"/>
+      </w:pPr>
+      <w:rPr>
+        <w:rFonts w:ascii="Wingdings" w:hAnsi="Wingdings" w:hint="default"/>
+        <w:sz w:val="20"/>
+      </w:rPr>
+    </w:lvl>
+    <w:lvl w:ilvl="5" w:tentative="1">
+      <w:start w:val="1"/>
+      <w:numFmt w:val="bullet"/>
+      <w:lvlText w:val=""/>
+      <w:lvlJc w:val="left"/>
+      <w:pPr>
+        <w:tabs>
+          <w:tab w:val="num" w:pos="4320"/>
+        </w:tabs>
+        <w:ind w:left="4320" w:hanging="360"/>
+      </w:pPr>
+      <w:rPr>
+        <w:rFonts w:ascii="Wingdings" w:hAnsi="Wingdings" w:hint="default"/>
+        <w:sz w:val="20"/>
+      </w:rPr>
+    </w:lvl>
+    <w:lvl w:ilvl="6" w:tentative="1">
+      <w:start w:val="1"/>
+      <w:numFmt w:val="bullet"/>
+      <w:lvlText w:val=""/>
+      <w:lvlJc w:val="left"/>
+      <w:pPr>
+        <w:tabs>
+          <w:tab w:val="num" w:pos="5040"/>
+        </w:tabs>
+        <w:ind w:left="5040" w:hanging="360"/>
+      </w:pPr>
+      <w:rPr>
+        <w:rFonts w:ascii="Wingdings" w:hAnsi="Wingdings" w:hint="default"/>
+        <w:sz w:val="20"/>
+      </w:rPr>
+    </w:lvl>
+    <w:lvl w:ilvl="7" w:tentative="1">
+      <w:start w:val="1"/>
+      <w:numFmt w:val="bullet"/>
+      <w:lvlText w:val=""/>
+      <w:lvlJc w:val="left"/>
+      <w:pPr>
+        <w:tabs>
+          <w:tab w:val="num" w:pos="5760"/>
+        </w:tabs>
+        <w:ind w:left="5760" w:hanging="360"/>
+      </w:pPr>
+      <w:rPr>
+        <w:rFonts w:ascii="Wingdings" w:hAnsi="Wingdings" w:hint="default"/>
+        <w:sz w:val="20"/>
+      </w:rPr>
+    </w:lvl>
+    <w:lvl w:ilvl="8" w:tentative="1">
+      <w:start w:val="1"/>
+      <w:numFmt w:val="bullet"/>
+      <w:lvlText w:val=""/>
+      <w:lvlJc w:val="left"/>
+      <w:pPr>
+        <w:tabs>
+          <w:tab w:val="num" w:pos="6480"/>
+        </w:tabs>
+        <w:ind w:left="6480" w:hanging="360"/>
+      </w:pPr>
+      <w:rPr>
+        <w:rFonts w:ascii="Wingdings" w:hAnsi="Wingdings" w:hint="default"/>
+        <w:sz w:val="20"/>
+      </w:rPr>
+    </w:lvl>
+  </w:abstractNum>
+  <w:abstractNum w:abstractNumId="4" w15:restartNumberingAfterBreak="0">
     <w:nsid w:val="58AE42AD"/>
     <w:multiLevelType w:val="multilevel"/>
     <w:tmpl w:val="4F443882"/>
@@ -1661,7 +2269,156 @@
       </w:rPr>
     </w:lvl>
   </w:abstractNum>
-  <w:abstractNum w:abstractNumId="2" w15:restartNumberingAfterBreak="0">
+  <w:abstractNum w:abstractNumId="5" w15:restartNumberingAfterBreak="0">
+    <w:nsid w:val="5B727FAD"/>
+    <w:multiLevelType w:val="multilevel"/>
+    <w:tmpl w:val="D35E7010"/>
+    <w:lvl w:ilvl="0">
+      <w:start w:val="1"/>
+      <w:numFmt w:val="bullet"/>
+      <w:lvlText w:val=""/>
+      <w:lvlJc w:val="left"/>
+      <w:pPr>
+        <w:tabs>
+          <w:tab w:val="num" w:pos="720"/>
+        </w:tabs>
+        <w:ind w:left="720" w:hanging="360"/>
+      </w:pPr>
+      <w:rPr>
+        <w:rFonts w:ascii="Symbol" w:hAnsi="Symbol" w:hint="default"/>
+        <w:sz w:val="20"/>
+      </w:rPr>
+    </w:lvl>
+    <w:lvl w:ilvl="1">
+      <w:start w:val="1"/>
+      <w:numFmt w:val="bullet"/>
+      <w:lvlText w:val="o"/>
+      <w:lvlJc w:val="left"/>
+      <w:pPr>
+        <w:tabs>
+          <w:tab w:val="num" w:pos="1440"/>
+        </w:tabs>
+        <w:ind w:left="1440" w:hanging="360"/>
+      </w:pPr>
+      <w:rPr>
+        <w:rFonts w:ascii="Courier New" w:hAnsi="Courier New" w:hint="default"/>
+        <w:sz w:val="20"/>
+      </w:rPr>
+    </w:lvl>
+    <w:lvl w:ilvl="2" w:tentative="1">
+      <w:start w:val="1"/>
+      <w:numFmt w:val="bullet"/>
+      <w:lvlText w:val=""/>
+      <w:lvlJc w:val="left"/>
+      <w:pPr>
+        <w:tabs>
+          <w:tab w:val="num" w:pos="2160"/>
+        </w:tabs>
+        <w:ind w:left="2160" w:hanging="360"/>
+      </w:pPr>
+      <w:rPr>
+        <w:rFonts w:ascii="Wingdings" w:hAnsi="Wingdings" w:hint="default"/>
+        <w:sz w:val="20"/>
+      </w:rPr>
+    </w:lvl>
+    <w:lvl w:ilvl="3" w:tentative="1">
+      <w:start w:val="1"/>
+      <w:numFmt w:val="bullet"/>
+      <w:lvlText w:val=""/>
+      <w:lvlJc w:val="left"/>
+      <w:pPr>
+        <w:tabs>
+          <w:tab w:val="num" w:pos="2880"/>
+        </w:tabs>
+        <w:ind w:left="2880" w:hanging="360"/>
+      </w:pPr>
+      <w:rPr>
+        <w:rFonts w:ascii="Wingdings" w:hAnsi="Wingdings" w:hint="default"/>
+        <w:sz w:val="20"/>
+      </w:rPr>
+    </w:lvl>
+    <w:lvl w:ilvl="4" w:tentative="1">
+      <w:start w:val="1"/>
+      <w:numFmt w:val="bullet"/>
+      <w:lvlText w:val=""/>
+      <w:lvlJc w:val="left"/>
+      <w:pPr>
+        <w:tabs>
+          <w:tab w:val="num" w:pos="3600"/>
+        </w:tabs>
+        <w:ind w:left="3600" w:hanging="360"/>
+      </w:pPr>
+      <w:rPr>
+        <w:rFonts w:ascii="Wingdings" w:hAnsi="Wingdings" w:hint="default"/>
+        <w:sz w:val="20"/>
+      </w:rPr>
+    </w:lvl>
+    <w:lvl w:ilvl="5" w:tentative="1">
+      <w:start w:val="1"/>
+      <w:numFmt w:val="bullet"/>
+      <w:lvlText w:val=""/>
+      <w:lvlJc w:val="left"/>
+      <w:pPr>
+        <w:tabs>
+          <w:tab w:val="num" w:pos="4320"/>
+        </w:tabs>
+        <w:ind w:left="4320" w:hanging="360"/>
+      </w:pPr>
+      <w:rPr>
+        <w:rFonts w:ascii="Wingdings" w:hAnsi="Wingdings" w:hint="default"/>
+        <w:sz w:val="20"/>
+      </w:rPr>
+    </w:lvl>
+    <w:lvl w:ilvl="6" w:tentative="1">
+      <w:start w:val="1"/>
+      <w:numFmt w:val="bullet"/>
+      <w:lvlText w:val=""/>
+      <w:lvlJc w:val="left"/>
+      <w:pPr>
+        <w:tabs>
+          <w:tab w:val="num" w:pos="5040"/>
+        </w:tabs>
+        <w:ind w:left="5040" w:hanging="360"/>
+      </w:pPr>
+      <w:rPr>
+        <w:rFonts w:ascii="Wingdings" w:hAnsi="Wingdings" w:hint="default"/>
+        <w:sz w:val="20"/>
+      </w:rPr>
+    </w:lvl>
+    <w:lvl w:ilvl="7" w:tentative="1">
+      <w:start w:val="1"/>
+      <w:numFmt w:val="bullet"/>
+      <w:lvlText w:val=""/>
+      <w:lvlJc w:val="left"/>
+      <w:pPr>
+        <w:tabs>
+          <w:tab w:val="num" w:pos="5760"/>
+        </w:tabs>
+        <w:ind w:left="5760" w:hanging="360"/>
+      </w:pPr>
+      <w:rPr>
+        <w:rFonts w:ascii="Wingdings" w:hAnsi="Wingdings" w:hint="default"/>
+        <w:sz w:val="20"/>
+      </w:rPr>
+    </w:lvl>
+    <w:lvl w:ilvl="8" w:tentative="1">
+      <w:start w:val="1"/>
+      <w:numFmt w:val="bullet"/>
+      <w:lvlText w:val=""/>
+      <w:lvlJc w:val="left"/>
+      <w:pPr>
+        <w:tabs>
+          <w:tab w:val="num" w:pos="6480"/>
+        </w:tabs>
+        <w:ind w:left="6480" w:hanging="360"/>
+      </w:pPr>
+      <w:rPr>
+        <w:rFonts w:ascii="Wingdings" w:hAnsi="Wingdings" w:hint="default"/>
+        <w:sz w:val="20"/>
+      </w:rPr>
+    </w:lvl>
+  </w:abstractNum>
+  <w:abstractNum w:abstractNumId="6" w15:restartNumberingAfterBreak="0">
     <w:nsid w:val="73BB1F77"/>
     <w:multiLevelType w:val="multilevel"/>
     <w:tmpl w:val="806C42EC"/>
@@ -1811,13 +2568,25 @@
     </w:lvl>
   </w:abstractNum>
   <w:num w:numId="1">
-    <w:abstractNumId w:val="2"/>
+    <w:abstractNumId w:val="6"/>
   </w:num>
   <w:num w:numId="2">
-    <w:abstractNumId w:val="1"/>
+    <w:abstractNumId w:val="4"/>
   </w:num>
   <w:num w:numId="3">
     <w:abstractNumId w:val="0"/>
+  </w:num>
+  <w:num w:numId="4">
+    <w:abstractNumId w:val="5"/>
+  </w:num>
+  <w:num w:numId="5">
+    <w:abstractNumId w:val="1"/>
+  </w:num>
+  <w:num w:numId="6">
+    <w:abstractNumId w:val="3"/>
+  </w:num>
+  <w:num w:numId="7">
+    <w:abstractNumId w:val="2"/>
   </w:num>
 </w:numbering>
 </file>

</xml_diff>